<commit_message>
70% hardware, testing now
</commit_message>
<xml_diff>
--- a/vi_xu_ly.docx
+++ b/vi_xu_ly.docx
@@ -3,20 +3,278 @@
 <w:document xmlns:wpc="http://schemas.microsoft.com/office/word/2010/wordprocessingCanvas" xmlns:cx="http://schemas.microsoft.com/office/drawing/2014/chartex" xmlns:mc="http://schemas.openxmlformats.org/markup-compatibility/2006" xmlns:o="urn:schemas-microsoft-com:office:office" xmlns:r="http://schemas.openxmlformats.org/officeDocument/2006/relationships" xmlns:m="http://schemas.openxmlformats.org/officeDocument/2006/math" xmlns:v="urn:schemas-microsoft-com:vml" xmlns:wp14="http://schemas.microsoft.com/office/word/2010/wordprocessingDrawing" xmlns:wp="http://schemas.openxmlformats.org/drawingml/2006/wordprocessingDrawing" xmlns:w10="urn:schemas-microsoft-com:office:word" xmlns:w="http://schemas.openxmlformats.org/wordprocessingml/2006/main" xmlns:w14="http://schemas.microsoft.com/office/word/2010/wordml" xmlns:w15="http://schemas.microsoft.com/office/word/2012/wordml" xmlns:w16se="http://schemas.microsoft.com/office/word/2015/wordml/symex" xmlns:wpg="http://schemas.microsoft.com/office/word/2010/wordprocessingGroup" xmlns:wpi="http://schemas.microsoft.com/office/word/2010/wordprocessingInk" xmlns:wne="http://schemas.microsoft.com/office/word/2006/wordml" xmlns:wps="http://schemas.microsoft.com/office/word/2010/wordprocessingShape" mc:Ignorable="w14 w15 w16se wp14">
   <w:body>
     <w:p>
-      <w:r>
+      <w:pPr>
+        <w:rPr>
+          <w:rFonts w:ascii="Times New Roman" w:hAnsi="Times New Roman" w:cs="Times New Roman"/>
+          <w:sz w:val="28"/>
+          <w:szCs w:val="28"/>
+        </w:rPr>
+      </w:pPr>
+      <w:r>
+        <w:rPr>
+          <w:rFonts w:ascii="Times New Roman" w:hAnsi="Times New Roman" w:cs="Times New Roman"/>
+          <w:sz w:val="28"/>
+          <w:szCs w:val="28"/>
+        </w:rPr>
         <w:t>Tủ bảo quản thiết bị linh kiện chuyên dụng (Đặng Phan Nhật Minh-B2405313)</w:t>
       </w:r>
     </w:p>
     <w:p>
-      <w:r>
+      <w:pPr>
+        <w:rPr>
+          <w:rFonts w:ascii="Times New Roman" w:hAnsi="Times New Roman" w:cs="Times New Roman"/>
+          <w:b/>
+          <w:sz w:val="24"/>
+        </w:rPr>
+      </w:pPr>
+      <w:r>
+        <w:rPr>
+          <w:rFonts w:ascii="Times New Roman" w:hAnsi="Times New Roman" w:cs="Times New Roman"/>
+          <w:b/>
+          <w:sz w:val="28"/>
+        </w:rPr>
         <w:t>1. Mô tả nguyên lý hoạt động</w:t>
       </w:r>
     </w:p>
     <w:p>
-      <w:r>
+      <w:pPr>
+        <w:rPr>
+          <w:rFonts w:ascii="Times New Roman" w:hAnsi="Times New Roman" w:cs="Times New Roman"/>
+          <w:sz w:val="26"/>
+        </w:rPr>
+      </w:pPr>
+      <w:r>
+        <w:rPr>
+          <w:rFonts w:ascii="Times New Roman" w:hAnsi="Times New Roman" w:cs="Times New Roman"/>
+        </w:rPr>
         <w:tab/>
-        <w:t>- Tủ bảo quản linh kiện hoạt động theo nguyên lý giám sát và triệt tiêu độ ẩm tương đối bên trong tủ. Khi độ ẩm trong không gian bảo quản vượt mức an toàn, hệ thống tự động kích hoạt cơ chế hút ẩm</w:t>
-      </w:r>
+      </w:r>
+      <w:r>
+        <w:rPr>
+          <w:rFonts w:ascii="Times New Roman" w:hAnsi="Times New Roman" w:cs="Times New Roman"/>
+          <w:sz w:val="26"/>
+        </w:rPr>
+        <w:t>-Hệ thống tủ bảo quản hoạt động trên nguyên lý ngưng tụ hơi nước. Cảm biến liên tục đo và giám sát độ ẩm bên trong tủ. Khi độ ẩm vượt quá mức cài đặt, hệ thống tự động kích hoạt module làm lạnh để hạ nhiệt độ luồng khí xuống dưới điểm sương. Hơi nước dư thừa sẽ ngưng tụ thành nước lỏng và được dẫn xả ra ngoài, giúp hạ độ ẩm trong tủ. Khi độ ẩm giảm xuống đạt mức an toàn, hệ thống ngắt module làm lạnh và duy trì trạng thái chờ.</w:t>
+      </w:r>
+    </w:p>
+    <w:p>
+      <w:pPr>
+        <w:rPr>
+          <w:rFonts w:ascii="Times New Roman" w:hAnsi="Times New Roman" w:cs="Times New Roman"/>
+          <w:b/>
+          <w:sz w:val="28"/>
+        </w:rPr>
+      </w:pPr>
+      <w:r>
+        <w:rPr>
+          <w:rFonts w:ascii="Times New Roman" w:hAnsi="Times New Roman" w:cs="Times New Roman"/>
+          <w:b/>
+          <w:sz w:val="28"/>
+        </w:rPr>
+        <w:t>2. Phạm vi thực hiện</w:t>
+      </w:r>
+    </w:p>
+    <w:p>
+      <w:pPr>
+        <w:rPr>
+          <w:rFonts w:ascii="Times New Roman" w:hAnsi="Times New Roman" w:cs="Times New Roman"/>
+          <w:sz w:val="26"/>
+        </w:rPr>
+      </w:pPr>
+      <w:r>
+        <w:rPr>
+          <w:rFonts w:ascii="Times New Roman" w:hAnsi="Times New Roman" w:cs="Times New Roman"/>
+          <w:sz w:val="26"/>
+        </w:rPr>
+        <w:t>Phạm vi:</w:t>
+      </w:r>
+    </w:p>
+    <w:p>
+      <w:pPr>
+        <w:rPr>
+          <w:rFonts w:ascii="Times New Roman" w:hAnsi="Times New Roman" w:cs="Times New Roman"/>
+          <w:sz w:val="26"/>
+        </w:rPr>
+      </w:pPr>
+      <w:r>
+        <w:rPr>
+          <w:rFonts w:ascii="Times New Roman" w:hAnsi="Times New Roman" w:cs="Times New Roman"/>
+          <w:sz w:val="26"/>
+        </w:rPr>
+        <w:tab/>
+        <w:t>-</w:t>
+      </w:r>
+      <w:r>
+        <w:rPr>
+          <w:rFonts w:ascii="Times New Roman" w:hAnsi="Times New Roman" w:cs="Times New Roman"/>
+          <w:sz w:val="26"/>
+        </w:rPr>
+        <w:t xml:space="preserve">Giám sát và hiển thị thông số nhiệt độ, độ ẩm liên tục qua màn hình </w:t>
+      </w:r>
+      <w:r>
+        <w:rPr>
+          <w:rFonts w:ascii="Times New Roman" w:hAnsi="Times New Roman" w:cs="Times New Roman"/>
+          <w:sz w:val="26"/>
+        </w:rPr>
+        <w:t>OLED</w:t>
+      </w:r>
+      <w:r>
+        <w:rPr>
+          <w:rFonts w:ascii="Times New Roman" w:hAnsi="Times New Roman" w:cs="Times New Roman"/>
+          <w:sz w:val="26"/>
+        </w:rPr>
+        <w:t>.</w:t>
+      </w:r>
+    </w:p>
+    <w:p>
+      <w:pPr>
+        <w:rPr>
+          <w:rFonts w:ascii="Times New Roman" w:hAnsi="Times New Roman" w:cs="Times New Roman"/>
+          <w:sz w:val="26"/>
+        </w:rPr>
+      </w:pPr>
+      <w:r>
+        <w:rPr>
+          <w:rFonts w:ascii="Times New Roman" w:hAnsi="Times New Roman" w:cs="Times New Roman"/>
+          <w:sz w:val="26"/>
+        </w:rPr>
+        <w:tab/>
+        <w:t>-Cho phép người dùng tùy chỉnh ngưỡng độ ẩm thông qua nút xoay.</w:t>
+      </w:r>
+    </w:p>
+    <w:p>
+      <w:pPr>
+        <w:rPr>
+          <w:rFonts w:ascii="Times New Roman" w:hAnsi="Times New Roman" w:cs="Times New Roman"/>
+          <w:sz w:val="26"/>
+        </w:rPr>
+      </w:pPr>
+      <w:r>
+        <w:rPr>
+          <w:rFonts w:ascii="Times New Roman" w:hAnsi="Times New Roman" w:cs="Times New Roman"/>
+          <w:sz w:val="26"/>
+        </w:rPr>
+        <w:tab/>
+        <w:t>-Cảnh báo bằng còi và đèn LED khi độ ẩm hoặc nhiệt độ vượt ngưỡng an toàn.</w:t>
+      </w:r>
+    </w:p>
+    <w:p>
+      <w:pPr>
+        <w:rPr>
+          <w:rFonts w:ascii="Times New Roman" w:hAnsi="Times New Roman" w:cs="Times New Roman"/>
+          <w:sz w:val="26"/>
+        </w:rPr>
+      </w:pPr>
+      <w:r>
+        <w:rPr>
+          <w:rFonts w:ascii="Times New Roman" w:hAnsi="Times New Roman" w:cs="Times New Roman"/>
+          <w:sz w:val="26"/>
+        </w:rPr>
+        <w:tab/>
+        <w:t>-</w:t>
+      </w:r>
+      <w:r>
+        <w:rPr>
+          <w:rFonts w:ascii="Times New Roman" w:hAnsi="Times New Roman" w:cs="Times New Roman"/>
+          <w:sz w:val="26"/>
+        </w:rPr>
+        <w:t>Tự động điều chỉnh quá trình hút ẩm bằng module làm lạnh</w:t>
+      </w:r>
+      <w:r>
+        <w:rPr>
+          <w:rFonts w:ascii="Times New Roman" w:hAnsi="Times New Roman" w:cs="Times New Roman"/>
+          <w:sz w:val="26"/>
+        </w:rPr>
+        <w:t>.</w:t>
+      </w:r>
+    </w:p>
+    <w:p>
+      <w:pPr>
+        <w:rPr>
+          <w:rFonts w:ascii="Times New Roman" w:hAnsi="Times New Roman" w:cs="Times New Roman"/>
+          <w:sz w:val="26"/>
+        </w:rPr>
+      </w:pPr>
+      <w:r>
+        <w:rPr>
+          <w:rFonts w:ascii="Times New Roman" w:hAnsi="Times New Roman" w:cs="Times New Roman"/>
+          <w:sz w:val="26"/>
+        </w:rPr>
+        <w:t>Giới hạn:</w:t>
+      </w:r>
+    </w:p>
+    <w:p>
+      <w:pPr>
+        <w:rPr>
+          <w:rFonts w:ascii="Times New Roman" w:hAnsi="Times New Roman" w:cs="Times New Roman"/>
+          <w:sz w:val="26"/>
+        </w:rPr>
+      </w:pPr>
+      <w:r>
+        <w:rPr>
+          <w:rFonts w:ascii="Times New Roman" w:hAnsi="Times New Roman" w:cs="Times New Roman"/>
+          <w:sz w:val="26"/>
+        </w:rPr>
+        <w:tab/>
+        <w:t>-Không có cơ chế bù ẩm chủ động.</w:t>
+      </w:r>
+    </w:p>
+    <w:p>
+      <w:pPr>
+        <w:rPr>
+          <w:rFonts w:ascii="Times New Roman" w:hAnsi="Times New Roman" w:cs="Times New Roman"/>
+          <w:sz w:val="26"/>
+        </w:rPr>
+      </w:pPr>
+      <w:r>
+        <w:rPr>
+          <w:rFonts w:ascii="Times New Roman" w:hAnsi="Times New Roman" w:cs="Times New Roman"/>
+          <w:sz w:val="26"/>
+        </w:rPr>
+        <w:tab/>
+        <w:t>-Hệ thống chỉ kiểm soát độ ẩm ở mức nhất định.</w:t>
+      </w:r>
+    </w:p>
+    <w:p>
+      <w:pPr>
+        <w:rPr>
+          <w:rFonts w:ascii="Times New Roman" w:hAnsi="Times New Roman" w:cs="Times New Roman"/>
+          <w:sz w:val="26"/>
+        </w:rPr>
+      </w:pPr>
+      <w:r>
+        <w:rPr>
+          <w:rFonts w:ascii="Times New Roman" w:hAnsi="Times New Roman" w:cs="Times New Roman"/>
+          <w:sz w:val="26"/>
+        </w:rPr>
+        <w:tab/>
+        <w:t xml:space="preserve">-Không điều chỉnh được nhiệt độ. </w:t>
+      </w:r>
+    </w:p>
+    <w:p>
+      <w:pPr>
+        <w:rPr>
+          <w:rFonts w:ascii="Times New Roman" w:hAnsi="Times New Roman" w:cs="Times New Roman"/>
+          <w:sz w:val="26"/>
+        </w:rPr>
+      </w:pPr>
+      <w:r>
+        <w:rPr>
+          <w:rFonts w:ascii="Times New Roman" w:hAnsi="Times New Roman" w:cs="Times New Roman"/>
+          <w:sz w:val="26"/>
+        </w:rPr>
+        <w:tab/>
+      </w:r>
+      <w:r>
+        <w:rPr>
+          <w:rFonts w:ascii="Times New Roman" w:hAnsi="Times New Roman" w:cs="Times New Roman"/>
+          <w:sz w:val="26"/>
+        </w:rPr>
+        <w:t>-Phụ thuộc hoàn toàn vào nguồn điện adapter.</w:t>
+      </w:r>
+    </w:p>
+    <w:p/>
+    <w:p>
       <w:bookmarkStart w:id="0" w:name="_GoBack"/>
       <w:bookmarkEnd w:id="0"/>
     </w:p>

</xml_diff>